<commit_message>
Informe final corregido: figuras v2, matrices de confusion y texto revisado
</commit_message>
<xml_diff>
--- a/reports/informe_final.docx
+++ b/reports/informe_final.docx
@@ -3759,10 +3759,7 @@
         <w:t xml:space="preserve">[precio_dia_1, ..., precio_dia_7]</w:t>
       </w:r>
       <w:r>
-        <w:t xml:space="preserve"> </w:t>
-      </w:r>
-      <w:r>
-        <w:t xml:space="preserve">para identificar perfiles cualitativos de trayectoria de precios. La selección de k = 4 se realizó por criterio combinado de</w:t>
+        <w:t xml:space="preserve">, calculados sobre los 965 mercados del dataset completo con imputación forward-fill/backward-fill, para identificar perfiles cualitativos de trayectoria de precios. La selección de k = 4 se realizó por criterio combinado de</w:t>
       </w:r>
       <w:r>
         <w:t xml:space="preserve"> </w:t>
@@ -8424,6 +8421,18 @@
         <w:pStyle w:val="BodyText"/>
       </w:pPr>
       <w:r>
+        <w:rPr>
+          <w:i/>
+          <w:iCs/>
+        </w:rPr>
+        <w:t xml:space="preserve">Nota: Crypto (n=3 en test, ningún YES) se excluye de la tabla por tamaño de muestra insuficiente para calcular métricas confiables. Los 202 mercados mostrados representan el 98,5% del test set (205 total).</w:t>
+      </w:r>
+    </w:p>
+    <w:p>
+      <w:pPr>
+        <w:pStyle w:val="BodyText"/>
+      </w:pPr>
+      <w:r>
         <w:drawing>
           <wp:inline>
             <wp:extent cx="5334000" cy="2051538"/>
@@ -10362,7 +10371,7 @@
         <w:t xml:space="preserve">saga</w:t>
       </w:r>
       <w:r>
-        <w:t xml:space="preserve">. El cambio inesperadamente mejoró los resultados de LR-C: AUC pasó de 0,8217 (liblinear) a 0,8339 (saga), presumiblemente por la mayor capacidad del solver SAGA para explorar el espacio de parámetros con regularización L1 estricta.</w:t>
+        <w:t xml:space="preserve">. El cambio mejoró los resultados de LR-C de forma apreciable, presumiblemente por la mayor capacidad del solver SAGA para explorar el espacio de parámetros con regularización L1 estricta.</w:t>
       </w:r>
     </w:p>
     <w:p>
@@ -13101,18 +13110,18 @@
               <w:pStyle w:val="Compact"/>
             </w:pPr>
             <w:r>
-              <w:t xml:space="preserve">0,462</w:t>
-            </w:r>
-          </w:p>
-        </w:tc>
-        <w:tc>
-          <w:tcPr/>
-          <w:p>
-            <w:pPr>
-              <w:pStyle w:val="Compact"/>
-            </w:pPr>
-            <w:r>
-              <w:t xml:space="preserve">0,650</w:t>
+              <w:t xml:space="preserve">0,357</w:t>
+            </w:r>
+          </w:p>
+        </w:tc>
+        <w:tc>
+          <w:tcPr/>
+          <w:p>
+            <w:pPr>
+              <w:pStyle w:val="Compact"/>
+            </w:pPr>
+            <w:r>
+              <w:t xml:space="preserve">0,889</w:t>
             </w:r>
           </w:p>
         </w:tc>
@@ -13162,18 +13171,18 @@
               <w:pStyle w:val="Compact"/>
             </w:pPr>
             <w:r>
-              <w:t xml:space="preserve">0,462</w:t>
-            </w:r>
-          </w:p>
-        </w:tc>
-        <w:tc>
-          <w:tcPr/>
-          <w:p>
-            <w:pPr>
-              <w:pStyle w:val="Compact"/>
-            </w:pPr>
-            <w:r>
-              <w:t xml:space="preserve">0,391</w:t>
+              <w:t xml:space="preserve">0,652</w:t>
+            </w:r>
+          </w:p>
+        </w:tc>
+        <w:tc>
+          <w:tcPr/>
+          <w:p>
+            <w:pPr>
+              <w:pStyle w:val="Compact"/>
+            </w:pPr>
+            <w:r>
+              <w:t xml:space="preserve">0,348</w:t>
             </w:r>
           </w:p>
         </w:tc>
@@ -15698,40 +15707,40 @@
               <w:pStyle w:val="Compact"/>
             </w:pPr>
             <w:r>
-              <w:t xml:space="preserve">9</w:t>
-            </w:r>
-          </w:p>
-        </w:tc>
-        <w:tc>
-          <w:tcPr/>
-          <w:p>
-            <w:pPr>
-              <w:pStyle w:val="Compact"/>
-            </w:pPr>
-            <w:r>
-              <w:t xml:space="preserve">9</w:t>
-            </w:r>
-          </w:p>
-        </w:tc>
-        <w:tc>
-          <w:tcPr/>
-          <w:p>
-            <w:pPr>
-              <w:pStyle w:val="Compact"/>
-            </w:pPr>
-            <w:r>
-              <w:t xml:space="preserve">14</w:t>
-            </w:r>
-          </w:p>
-        </w:tc>
-        <w:tc>
-          <w:tcPr/>
-          <w:p>
-            <w:pPr>
-              <w:pStyle w:val="Compact"/>
-            </w:pPr>
-            <w:r>
-              <w:t xml:space="preserve">173</w:t>
+              <w:t xml:space="preserve">8</w:t>
+            </w:r>
+          </w:p>
+        </w:tc>
+        <w:tc>
+          <w:tcPr/>
+          <w:p>
+            <w:pPr>
+              <w:pStyle w:val="Compact"/>
+            </w:pPr>
+            <w:r>
+              <w:t xml:space="preserve">1</w:t>
+            </w:r>
+          </w:p>
+        </w:tc>
+        <w:tc>
+          <w:tcPr/>
+          <w:p>
+            <w:pPr>
+              <w:pStyle w:val="Compact"/>
+            </w:pPr>
+            <w:r>
+              <w:t xml:space="preserve">15</w:t>
+            </w:r>
+          </w:p>
+        </w:tc>
+        <w:tc>
+          <w:tcPr/>
+          <w:p>
+            <w:pPr>
+              <w:pStyle w:val="Compact"/>
+            </w:pPr>
+            <w:r>
+              <w:t xml:space="preserve">181</w:t>
             </w:r>
           </w:p>
         </w:tc>
@@ -15832,40 +15841,40 @@
               <w:pStyle w:val="Compact"/>
             </w:pPr>
             <w:r>
-              <w:t xml:space="preserve">12</w:t>
-            </w:r>
-          </w:p>
-        </w:tc>
-        <w:tc>
-          <w:tcPr/>
-          <w:p>
-            <w:pPr>
-              <w:pStyle w:val="Compact"/>
-            </w:pPr>
-            <w:r>
-              <w:t xml:space="preserve">14</w:t>
-            </w:r>
-          </w:p>
-        </w:tc>
-        <w:tc>
-          <w:tcPr/>
-          <w:p>
-            <w:pPr>
-              <w:pStyle w:val="Compact"/>
-            </w:pPr>
-            <w:r>
-              <w:t xml:space="preserve">11</w:t>
-            </w:r>
-          </w:p>
-        </w:tc>
-        <w:tc>
-          <w:tcPr/>
-          <w:p>
-            <w:pPr>
-              <w:pStyle w:val="Compact"/>
-            </w:pPr>
-            <w:r>
-              <w:t xml:space="preserve">168</w:t>
+              <w:t xml:space="preserve">15</w:t>
+            </w:r>
+          </w:p>
+        </w:tc>
+        <w:tc>
+          <w:tcPr/>
+          <w:p>
+            <w:pPr>
+              <w:pStyle w:val="Compact"/>
+            </w:pPr>
+            <w:r>
+              <w:t xml:space="preserve">27</w:t>
+            </w:r>
+          </w:p>
+        </w:tc>
+        <w:tc>
+          <w:tcPr/>
+          <w:p>
+            <w:pPr>
+              <w:pStyle w:val="Compact"/>
+            </w:pPr>
+            <w:r>
+              <w:t xml:space="preserve">8</w:t>
+            </w:r>
+          </w:p>
+        </w:tc>
+        <w:tc>
+          <w:tcPr/>
+          <w:p>
+            <w:pPr>
+              <w:pStyle w:val="Compact"/>
+            </w:pPr>
+            <w:r>
+              <w:t xml:space="preserve">155</w:t>
             </w:r>
           </w:p>
         </w:tc>
@@ -15977,7 +15986,7 @@
               <w:pStyle w:val="Compact"/>
             </w:pPr>
             <w:r>
-              <w:t xml:space="preserve">10</w:t>
+              <w:t xml:space="preserve">11</w:t>
             </w:r>
           </w:p>
         </w:tc>
@@ -15999,7 +16008,7 @@
               <w:pStyle w:val="Compact"/>
             </w:pPr>
             <w:r>
-              <w:t xml:space="preserve">172</w:t>
+              <w:t xml:space="preserve">171</w:t>
             </w:r>
           </w:p>
         </w:tc>

</xml_diff>